<commit_message>
Them source code, database, readme
</commit_message>
<xml_diff>
--- a/LAB8/Bai_8_Cua_hang_nuoc_giai_khat.docx
+++ b/LAB8/Bai_8_Cua_hang_nuoc_giai_khat.docx
@@ -690,15 +690,11 @@
           <w:p>
             <w:pPr>
               <w:spacing w:after="120" w:line="300" w:lineRule="auto"/>
-              <w:rPr>
-                <w:lang w:val="en-US"/>
-              </w:rPr>
             </w:pPr>
             <w:r>
               <w:rPr>
                 <w:b/>
                 <w:bCs/>
-                <w:lang w:val="en-US"/>
               </w:rPr>
               <w:t>Bán hàng &amp; Hẹn giao đợt</w:t>
             </w:r>
@@ -712,14 +708,8 @@
           <w:p>
             <w:pPr>
               <w:spacing w:after="120" w:line="300" w:lineRule="auto"/>
-              <w:rPr>
-                <w:lang w:val="en-US"/>
-              </w:rPr>
-            </w:pPr>
-            <w:r>
-              <w:rPr>
-                <w:lang w:val="en-US"/>
-              </w:rPr>
+            </w:pPr>
+            <w:r>
               <w:t>Thông tin Khách hàng, Mặt hàng yêu cầu, Số lượng mua, Loại khách.</w:t>
             </w:r>
           </w:p>
@@ -732,14 +722,8 @@
           <w:p>
             <w:pPr>
               <w:spacing w:after="120" w:line="300" w:lineRule="auto"/>
-              <w:rPr>
-                <w:lang w:val="en-US"/>
-              </w:rPr>
-            </w:pPr>
-            <w:r>
-              <w:rPr>
-                <w:lang w:val="en-US"/>
-              </w:rPr>
+            </w:pPr>
+            <w:r>
               <w:t>Kiểm tra kho. Đủ kho: xuất bán. Thiếu kho: đối với Khách quen lập Phiếu hẹn giao đợt; Khách vãng lai bán theo số lượng thực tế.</w:t>
             </w:r>
           </w:p>
@@ -752,14 +736,8 @@
           <w:p>
             <w:pPr>
               <w:spacing w:after="120" w:line="300" w:lineRule="auto"/>
-              <w:rPr>
-                <w:lang w:val="en-US"/>
-              </w:rPr>
-            </w:pPr>
-            <w:r>
-              <w:rPr>
-                <w:lang w:val="en-US"/>
-              </w:rPr>
+            </w:pPr>
+            <w:r>
               <w:t>Hóa đơn thanh toán, Phiếu hẹn giao hàng.</w:t>
             </w:r>
           </w:p>
@@ -1520,13 +1498,11 @@
               <w:jc w:val="center"/>
               <w:rPr>
                 <w:color w:val="000000" w:themeColor="text1"/>
-                <w:lang w:val="en-US"/>
-              </w:rPr>
-            </w:pPr>
-            <w:r>
-              <w:rPr>
-                <w:color w:val="000000" w:themeColor="text1"/>
-                <w:lang w:val="en-US"/>
+              </w:rPr>
+            </w:pPr>
+            <w:r>
+              <w:rPr>
+                <w:color w:val="000000" w:themeColor="text1"/>
               </w:rPr>
               <w:t>Lập Đơn đặt hàng (ĐĐH)</w:t>
             </w:r>
@@ -1542,13 +1518,11 @@
               <w:jc w:val="center"/>
               <w:rPr>
                 <w:color w:val="000000" w:themeColor="text1"/>
-                <w:lang w:val="en-US"/>
-              </w:rPr>
-            </w:pPr>
-            <w:r>
-              <w:rPr>
-                <w:color w:val="000000" w:themeColor="text1"/>
-                <w:lang w:val="en-US"/>
+              </w:rPr>
+            </w:pPr>
+            <w:r>
+              <w:rPr>
+                <w:color w:val="000000" w:themeColor="text1"/>
               </w:rPr>
               <w:t>Cho phép Nhân viên chọn Nhà cung ứng, chọn các mặt hàng NGK, nhập số lượng đặt và ngày nhận dự kiến để gửi ĐĐH.</w:t>
             </w:r>
@@ -1566,13 +1540,11 @@
               <w:jc w:val="center"/>
               <w:rPr>
                 <w:color w:val="000000" w:themeColor="text1"/>
-                <w:lang w:val="en-US"/>
-              </w:rPr>
-            </w:pPr>
-            <w:r>
-              <w:rPr>
-                <w:color w:val="000000" w:themeColor="text1"/>
-                <w:lang w:val="en-US"/>
+              </w:rPr>
+            </w:pPr>
+            <w:r>
+              <w:rPr>
+                <w:color w:val="000000" w:themeColor="text1"/>
               </w:rPr>
               <w:t>Tiếp nhận Phiếu giao hàng</w:t>
             </w:r>
@@ -1588,13 +1560,11 @@
               <w:jc w:val="center"/>
               <w:rPr>
                 <w:color w:val="000000" w:themeColor="text1"/>
-                <w:lang w:val="en-US"/>
-              </w:rPr>
-            </w:pPr>
-            <w:r>
-              <w:rPr>
-                <w:color w:val="000000" w:themeColor="text1"/>
-                <w:lang w:val="en-US"/>
+              </w:rPr>
+            </w:pPr>
+            <w:r>
+              <w:rPr>
+                <w:color w:val="000000" w:themeColor="text1"/>
               </w:rPr>
               <w:t>Ghi nhận các đợt giao hàng từ NCC (tối đa 3 đợt/ĐĐH), kiểm tra số lượng thực giao, tổng tiền phải trả và tự động cộng tăng tồn kho.</w:t>
             </w:r>
@@ -1658,13 +1628,11 @@
               <w:jc w:val="center"/>
               <w:rPr>
                 <w:color w:val="000000" w:themeColor="text1"/>
-                <w:lang w:val="en-US"/>
-              </w:rPr>
-            </w:pPr>
-            <w:r>
-              <w:rPr>
-                <w:color w:val="000000" w:themeColor="text1"/>
-                <w:lang w:val="en-US"/>
+              </w:rPr>
+            </w:pPr>
+            <w:r>
+              <w:rPr>
+                <w:color w:val="000000" w:themeColor="text1"/>
               </w:rPr>
               <w:t>Lập Hóa đơn bán hàng</w:t>
             </w:r>
@@ -1680,13 +1648,11 @@
               <w:jc w:val="center"/>
               <w:rPr>
                 <w:color w:val="000000" w:themeColor="text1"/>
-                <w:lang w:val="en-US"/>
-              </w:rPr>
-            </w:pPr>
-            <w:r>
-              <w:rPr>
-                <w:color w:val="000000" w:themeColor="text1"/>
-                <w:lang w:val="en-US"/>
+              </w:rPr>
+            </w:pPr>
+            <w:r>
+              <w:rPr>
+                <w:color w:val="000000" w:themeColor="text1"/>
               </w:rPr>
               <w:t>Khởi tạo Hóa đơn, tính tổng tiền bán, trừ giảm số lượng tồn kho thực tế.</w:t>
             </w:r>
@@ -1704,13 +1670,11 @@
               <w:jc w:val="center"/>
               <w:rPr>
                 <w:color w:val="000000" w:themeColor="text1"/>
-                <w:lang w:val="en-US"/>
-              </w:rPr>
-            </w:pPr>
-            <w:r>
-              <w:rPr>
-                <w:color w:val="000000" w:themeColor="text1"/>
-                <w:lang w:val="en-US"/>
+              </w:rPr>
+            </w:pPr>
+            <w:r>
+              <w:rPr>
+                <w:color w:val="000000" w:themeColor="text1"/>
               </w:rPr>
               <w:t>Lập Phiếu hẹn giao đợt</w:t>
             </w:r>
@@ -1732,9 +1696,15 @@
             <w:r>
               <w:rPr>
                 <w:color w:val="000000" w:themeColor="text1"/>
-                <w:lang w:val="en-US"/>
-              </w:rPr>
-              <w:t>Cho phép lập Phiếu hẹn giao nhiều đợt đối với Khách quen khi kho không đủ hàng. Chặn lập phiếu hẹn đối với Khách vãng lai.</w:t>
+              </w:rPr>
+              <w:t xml:space="preserve">Cho phép lập Phiếu hẹn giao nhiều đợt đối với Khách quen khi kho không đủ hàng. </w:t>
+            </w:r>
+            <w:r>
+              <w:rPr>
+                <w:color w:val="000000" w:themeColor="text1"/>
+                <w:lang w:val="en-US"/>
+              </w:rPr>
+              <w:t>Chặn lập phiếu hẹn đối với Khách vãng lai.</w:t>
             </w:r>
           </w:p>
         </w:tc>
@@ -1842,13 +1812,11 @@
               <w:jc w:val="center"/>
               <w:rPr>
                 <w:color w:val="000000" w:themeColor="text1"/>
-                <w:lang w:val="en-US"/>
-              </w:rPr>
-            </w:pPr>
-            <w:r>
-              <w:rPr>
-                <w:color w:val="000000" w:themeColor="text1"/>
-                <w:lang w:val="en-US"/>
+              </w:rPr>
+            </w:pPr>
+            <w:r>
+              <w:rPr>
+                <w:color w:val="000000" w:themeColor="text1"/>
               </w:rPr>
               <w:t>Quản lý NGK &amp; Nhãn hiệu</w:t>
             </w:r>
@@ -1864,13 +1832,11 @@
               <w:jc w:val="center"/>
               <w:rPr>
                 <w:color w:val="000000" w:themeColor="text1"/>
-                <w:lang w:val="en-US"/>
-              </w:rPr>
-            </w:pPr>
-            <w:r>
-              <w:rPr>
-                <w:color w:val="000000" w:themeColor="text1"/>
-                <w:lang w:val="en-US"/>
+              </w:rPr>
+            </w:pPr>
+            <w:r>
+              <w:rPr>
+                <w:color w:val="000000" w:themeColor="text1"/>
               </w:rPr>
               <w:t>Cập nhật thông tin Nhãn hiệu/Loại NGK, sản phẩm NGK (mã, tên, đơn vị tính, giá bán).</w:t>
             </w:r>
@@ -1888,13 +1854,11 @@
               <w:jc w:val="center"/>
               <w:rPr>
                 <w:color w:val="000000" w:themeColor="text1"/>
-                <w:lang w:val="en-US"/>
-              </w:rPr>
-            </w:pPr>
-            <w:r>
-              <w:rPr>
-                <w:color w:val="000000" w:themeColor="text1"/>
-                <w:lang w:val="en-US"/>
+              </w:rPr>
+            </w:pPr>
+            <w:r>
+              <w:rPr>
+                <w:color w:val="000000" w:themeColor="text1"/>
               </w:rPr>
               <w:t>Quản lý NCC &amp; Khách hàng</w:t>
             </w:r>
@@ -1910,13 +1874,11 @@
               <w:jc w:val="center"/>
               <w:rPr>
                 <w:color w:val="000000" w:themeColor="text1"/>
-                <w:lang w:val="en-US"/>
-              </w:rPr>
-            </w:pPr>
-            <w:r>
-              <w:rPr>
-                <w:color w:val="000000" w:themeColor="text1"/>
-                <w:lang w:val="en-US"/>
+              </w:rPr>
+            </w:pPr>
+            <w:r>
+              <w:rPr>
+                <w:color w:val="000000" w:themeColor="text1"/>
               </w:rPr>
               <w:t>Lưu trữ thông tin Nhà cung ứng (tên, địa chỉ, SĐT) và thông tin Khách hàng (phân loại Khách quen / Khách vãng lai).</w:t>
             </w:r>
@@ -2591,9 +2553,29 @@
           <w:color w:val="1F3864"/>
           <w:sz w:val="26"/>
           <w:szCs w:val="26"/>
-          <w:lang w:val="en-US"/>
-        </w:rPr>
-      </w:pPr>
+        </w:rPr>
+      </w:pPr>
+    </w:p>
+    <w:p>
+      <w:pPr>
+        <w:rPr>
+          <w:b/>
+          <w:bCs/>
+          <w:color w:val="000000" w:themeColor="text1"/>
+          <w:sz w:val="26"/>
+          <w:szCs w:val="26"/>
+        </w:rPr>
+      </w:pPr>
+      <w:r>
+        <w:rPr>
+          <w:b/>
+          <w:bCs/>
+          <w:color w:val="000000" w:themeColor="text1"/>
+          <w:sz w:val="26"/>
+          <w:szCs w:val="26"/>
+        </w:rPr>
+        <w:t>2.PHA PHÂN TÍCH</w:t>
+      </w:r>
     </w:p>
     <w:p>
       <w:pPr>
@@ -2607,7 +2589,7 @@
           <w:sz w:val="26"/>
           <w:szCs w:val="26"/>
         </w:rPr>
-        <w:t>2. CÂU HỎI</w:t>
+        <w:t>CÂU HỎI</w:t>
       </w:r>
     </w:p>
     <w:p>
@@ -2890,6 +2872,7 @@
           <w:bCs/>
           <w:lang w:val="en-US"/>
         </w:rPr>
+        <w:lastRenderedPageBreak/>
         <w:t>1.2. Danh sách Use Case Tổng quát</w:t>
       </w:r>
     </w:p>
@@ -2925,7 +2908,6 @@
                 <w:bCs/>
                 <w:lang w:val="en-US"/>
               </w:rPr>
-              <w:lastRenderedPageBreak/>
               <w:t>Mã UC</w:t>
             </w:r>
           </w:p>
@@ -3805,7 +3787,6 @@
           <w:b/>
           <w:bCs/>
         </w:rPr>
-        <w:lastRenderedPageBreak/>
         <w:t>UC02: Quản lý Bán hàng &amp; Xử lý Giao hàng</w:t>
       </w:r>
     </w:p>
@@ -4517,6 +4498,7 @@
                 <w:rFonts w:asciiTheme="majorHAnsi" w:hAnsiTheme="majorHAnsi" w:cstheme="majorHAnsi"/>
                 <w:lang w:val="en-US"/>
               </w:rPr>
+              <w:lastRenderedPageBreak/>
               <w:t>Tiền điều kiện</w:t>
             </w:r>
           </w:p>
@@ -4563,7 +4545,6 @@
                 <w:rFonts w:asciiTheme="majorHAnsi" w:hAnsiTheme="majorHAnsi" w:cstheme="majorHAnsi"/>
                 <w:lang w:val="en-US"/>
               </w:rPr>
-              <w:lastRenderedPageBreak/>
               <w:t>Hậu điều kiện</w:t>
             </w:r>
           </w:p>
@@ -7371,6 +7352,26 @@
         <w:ind w:left="504" w:hanging="504"/>
         <w:jc w:val="both"/>
         <w:rPr>
+          <w:b/>
+          <w:bCs/>
+          <w:color w:val="000000" w:themeColor="text1"/>
+        </w:rPr>
+      </w:pPr>
+      <w:r>
+        <w:rPr>
+          <w:b/>
+          <w:bCs/>
+          <w:color w:val="000000" w:themeColor="text1"/>
+        </w:rPr>
+        <w:t>3. PHA THIẾT KẾ</w:t>
+      </w:r>
+    </w:p>
+    <w:p>
+      <w:pPr>
+        <w:spacing w:after="120" w:line="300" w:lineRule="auto"/>
+        <w:ind w:left="504" w:hanging="504"/>
+        <w:jc w:val="both"/>
+        <w:rPr>
           <w:color w:val="EE0000"/>
         </w:rPr>
       </w:pPr>
@@ -7388,6 +7389,15 @@
         </w:rPr>
         <w:t>Vẽ Activity Diagram cho Câu 4 ở trên. Lưu lại mô hình với tên file phù hợp.</w:t>
       </w:r>
+    </w:p>
+    <w:p>
+      <w:pPr>
+        <w:spacing w:after="120" w:line="300" w:lineRule="auto"/>
+        <w:jc w:val="both"/>
+        <w:rPr>
+          <w:color w:val="EE0000"/>
+        </w:rPr>
+      </w:pPr>
     </w:p>
     <w:p>
       <w:r>
@@ -7480,10 +7490,70 @@
       </w:r>
     </w:p>
     <w:p>
+      <w:r>
+        <w:rPr>
+          <w:noProof/>
+        </w:rPr>
+        <w:lastRenderedPageBreak/>
+        <w:drawing>
+          <wp:inline distT="0" distB="0" distL="0" distR="0" wp14:anchorId="158B390F" wp14:editId="23B7BE92">
+            <wp:extent cx="5361709" cy="6681968"/>
+            <wp:effectExtent l="0" t="0" r="0" b="0"/>
+            <wp:docPr id="1700023088" name="Picture 3"/>
+            <wp:cNvGraphicFramePr>
+              <a:graphicFrameLocks xmlns:a="http://schemas.openxmlformats.org/drawingml/2006/main" noChangeAspect="1"/>
+            </wp:cNvGraphicFramePr>
+            <a:graphic xmlns:a="http://schemas.openxmlformats.org/drawingml/2006/main">
+              <a:graphicData uri="http://schemas.openxmlformats.org/drawingml/2006/picture">
+                <pic:pic xmlns:pic="http://schemas.openxmlformats.org/drawingml/2006/picture">
+                  <pic:nvPicPr>
+                    <pic:cNvPr id="0" name="Picture 5"/>
+                    <pic:cNvPicPr>
+                      <a:picLocks noChangeAspect="1" noChangeArrowheads="1"/>
+                    </pic:cNvPicPr>
+                  </pic:nvPicPr>
+                  <pic:blipFill>
+                    <a:blip r:embed="rId11" cstate="print">
+                      <a:extLst>
+                        <a:ext uri="{28A0092B-C50C-407E-A947-70E740481C1C}">
+                          <a14:useLocalDpi xmlns:a14="http://schemas.microsoft.com/office/drawing/2010/main" val="0"/>
+                        </a:ext>
+                      </a:extLst>
+                    </a:blip>
+                    <a:srcRect/>
+                    <a:stretch>
+                      <a:fillRect/>
+                    </a:stretch>
+                  </pic:blipFill>
+                  <pic:spPr bwMode="auto">
+                    <a:xfrm>
+                      <a:off x="0" y="0"/>
+                      <a:ext cx="5365875" cy="6687160"/>
+                    </a:xfrm>
+                    <a:prstGeom prst="rect">
+                      <a:avLst/>
+                    </a:prstGeom>
+                    <a:noFill/>
+                    <a:ln>
+                      <a:noFill/>
+                    </a:ln>
+                  </pic:spPr>
+                </pic:pic>
+              </a:graphicData>
+            </a:graphic>
+          </wp:inline>
+        </w:drawing>
+      </w:r>
+    </w:p>
+    <w:p>
+      <w:pPr>
+        <w:jc w:val="center"/>
+      </w:pPr>
+    </w:p>
+    <w:p>
       <w:pPr>
         <w:spacing w:after="120" w:line="300" w:lineRule="auto"/>
         <w:ind w:left="504" w:hanging="504"/>
-        <w:jc w:val="both"/>
         <w:rPr>
           <w:b/>
           <w:bCs/>
@@ -7491,446 +7561,181 @@
           <w:lang w:val="en-US"/>
         </w:rPr>
       </w:pPr>
-      <w:r>
+    </w:p>
+    <w:p>
+      <w:pPr>
+        <w:spacing w:after="120" w:line="300" w:lineRule="auto"/>
+        <w:ind w:left="504" w:hanging="504"/>
+        <w:rPr>
+          <w:b/>
+          <w:bCs/>
+          <w:color w:val="000000" w:themeColor="text1"/>
+        </w:rPr>
+      </w:pPr>
+    </w:p>
+    <w:p>
+      <w:pPr>
+        <w:spacing w:after="120" w:line="300" w:lineRule="auto"/>
+        <w:ind w:left="504" w:hanging="504"/>
+        <w:rPr>
+          <w:b/>
+          <w:bCs/>
+          <w:color w:val="000000" w:themeColor="text1"/>
+        </w:rPr>
+      </w:pPr>
+      <w:r>
+        <w:rPr>
+          <w:b/>
+          <w:bCs/>
+          <w:color w:val="000000" w:themeColor="text1"/>
+        </w:rPr>
+        <w:t>4</w:t>
+      </w:r>
+      <w:r>
+        <w:rPr>
+          <w:b/>
+          <w:bCs/>
+          <w:color w:val="000000" w:themeColor="text1"/>
+        </w:rPr>
+        <w:t xml:space="preserve">. </w:t>
+      </w:r>
+      <w:r>
+        <w:rPr>
+          <w:b/>
+          <w:bCs/>
+          <w:color w:val="000000" w:themeColor="text1"/>
+        </w:rPr>
+        <w:t xml:space="preserve">THIẾT KẾ </w:t>
+      </w:r>
+      <w:r>
+        <w:rPr>
+          <w:b/>
+          <w:bCs/>
+          <w:color w:val="000000" w:themeColor="text1"/>
+        </w:rPr>
+        <w:t>CSDL</w:t>
+      </w:r>
+    </w:p>
+    <w:p>
+      <w:pPr>
+        <w:spacing w:after="120" w:line="300" w:lineRule="auto"/>
+        <w:ind w:left="504" w:hanging="504"/>
+        <w:rPr>
+          <w:b/>
+          <w:bCs/>
+          <w:color w:val="000000" w:themeColor="text1"/>
+        </w:rPr>
+      </w:pPr>
+      <w:r>
+        <w:rPr>
+          <w:b/>
+          <w:bCs/>
+          <w:color w:val="000000" w:themeColor="text1"/>
+        </w:rPr>
+        <w:t>4.1. Sơ đồ ERD</w:t>
+      </w:r>
+    </w:p>
+    <w:p>
+      <w:pPr>
+        <w:spacing w:after="120" w:line="300" w:lineRule="auto"/>
+        <w:ind w:left="504" w:hanging="504"/>
+        <w:jc w:val="center"/>
         <w:rPr>
           <w:b/>
           <w:bCs/>
           <w:color w:val="000000" w:themeColor="text1"/>
           <w:lang w:val="en-US"/>
         </w:rPr>
-        <w:t>6.1. Các đối tượng tham gia (Lifelines)</w:t>
-      </w:r>
-    </w:p>
-    <w:p>
-      <w:pPr>
-        <w:numPr>
-          <w:ilvl w:val="0"/>
-          <w:numId w:val="21"/>
-        </w:numPr>
-        <w:spacing w:after="120" w:line="300" w:lineRule="auto"/>
-        <w:jc w:val="both"/>
-        <w:rPr>
-          <w:color w:val="000000" w:themeColor="text1"/>
-          <w:lang w:val="en-US"/>
-        </w:rPr>
-      </w:pPr>
-      <w:r>
-        <w:rPr>
-          <w:color w:val="000000" w:themeColor="text1"/>
-          <w:lang w:val="en-US"/>
-        </w:rPr>
-        <w:t>:NhanVien (Actor)</w:t>
-      </w:r>
-    </w:p>
-    <w:p>
-      <w:pPr>
-        <w:numPr>
-          <w:ilvl w:val="0"/>
-          <w:numId w:val="21"/>
-        </w:numPr>
-        <w:spacing w:after="120" w:line="300" w:lineRule="auto"/>
-        <w:jc w:val="both"/>
-        <w:rPr>
-          <w:color w:val="000000" w:themeColor="text1"/>
-          <w:lang w:val="en-US"/>
-        </w:rPr>
-      </w:pPr>
-      <w:r>
-        <w:rPr>
-          <w:color w:val="000000" w:themeColor="text1"/>
-          <w:lang w:val="en-US"/>
-        </w:rPr>
-        <w:t>:FrmPhieuGhiNo (Boundary)</w:t>
-      </w:r>
-    </w:p>
-    <w:p>
-      <w:pPr>
-        <w:numPr>
-          <w:ilvl w:val="0"/>
-          <w:numId w:val="21"/>
-        </w:numPr>
-        <w:spacing w:after="120" w:line="300" w:lineRule="auto"/>
-        <w:jc w:val="both"/>
-        <w:rPr>
-          <w:color w:val="000000" w:themeColor="text1"/>
-          <w:lang w:val="en-US"/>
-        </w:rPr>
-      </w:pPr>
-      <w:r>
-        <w:rPr>
-          <w:color w:val="000000" w:themeColor="text1"/>
-          <w:lang w:val="en-US"/>
-        </w:rPr>
-        <w:t>:GhiNoController (Control)</w:t>
-      </w:r>
-    </w:p>
-    <w:p>
-      <w:pPr>
-        <w:numPr>
-          <w:ilvl w:val="0"/>
-          <w:numId w:val="21"/>
-        </w:numPr>
-        <w:spacing w:after="120" w:line="300" w:lineRule="auto"/>
-        <w:jc w:val="both"/>
-        <w:rPr>
-          <w:color w:val="000000" w:themeColor="text1"/>
-          <w:lang w:val="en-US"/>
-        </w:rPr>
-      </w:pPr>
-      <w:r>
-        <w:rPr>
-          <w:color w:val="000000" w:themeColor="text1"/>
-          <w:lang w:val="en-US"/>
-        </w:rPr>
-        <w:t>:KhachHang (Entity)</w:t>
-      </w:r>
-    </w:p>
-    <w:p>
-      <w:pPr>
-        <w:numPr>
-          <w:ilvl w:val="0"/>
-          <w:numId w:val="21"/>
-        </w:numPr>
-        <w:spacing w:after="120" w:line="300" w:lineRule="auto"/>
-        <w:jc w:val="both"/>
-        <w:rPr>
-          <w:color w:val="000000" w:themeColor="text1"/>
-          <w:lang w:val="en-US"/>
-        </w:rPr>
-      </w:pPr>
-      <w:r>
-        <w:rPr>
-          <w:color w:val="000000" w:themeColor="text1"/>
-          <w:lang w:val="en-US"/>
-        </w:rPr>
-        <w:lastRenderedPageBreak/>
-        <w:t>:HoaDon (Entity)</w:t>
-      </w:r>
-    </w:p>
-    <w:p>
-      <w:pPr>
-        <w:numPr>
-          <w:ilvl w:val="0"/>
-          <w:numId w:val="21"/>
-        </w:numPr>
-        <w:spacing w:after="120" w:line="300" w:lineRule="auto"/>
-        <w:jc w:val="both"/>
-        <w:rPr>
-          <w:color w:val="000000" w:themeColor="text1"/>
-          <w:lang w:val="en-US"/>
-        </w:rPr>
-      </w:pPr>
-      <w:r>
-        <w:rPr>
-          <w:color w:val="000000" w:themeColor="text1"/>
-          <w:lang w:val="en-US"/>
-        </w:rPr>
-        <w:t>:PhieuGhiNo (Entity)</w:t>
-      </w:r>
-    </w:p>
-    <w:p>
-      <w:pPr>
-        <w:spacing w:after="120" w:line="300" w:lineRule="auto"/>
-        <w:ind w:left="504" w:hanging="504"/>
-        <w:jc w:val="both"/>
+      </w:pPr>
+      <w:r>
         <w:rPr>
           <w:b/>
           <w:bCs/>
           <w:color w:val="000000" w:themeColor="text1"/>
           <w:lang w:val="en-US"/>
         </w:rPr>
-      </w:pPr>
-      <w:r>
+        <w:lastRenderedPageBreak/>
+        <w:drawing>
+          <wp:inline distT="0" distB="0" distL="0" distR="0" wp14:anchorId="640305F0" wp14:editId="21C98216">
+            <wp:extent cx="5835534" cy="5806412"/>
+            <wp:effectExtent l="0" t="0" r="0" b="4445"/>
+            <wp:docPr id="113246190" name="Picture 5"/>
+            <wp:cNvGraphicFramePr>
+              <a:graphicFrameLocks xmlns:a="http://schemas.openxmlformats.org/drawingml/2006/main" noChangeAspect="1"/>
+            </wp:cNvGraphicFramePr>
+            <a:graphic xmlns:a="http://schemas.openxmlformats.org/drawingml/2006/main">
+              <a:graphicData uri="http://schemas.openxmlformats.org/drawingml/2006/picture">
+                <pic:pic xmlns:pic="http://schemas.openxmlformats.org/drawingml/2006/picture">
+                  <pic:nvPicPr>
+                    <pic:cNvPr id="0" name="Picture 12"/>
+                    <pic:cNvPicPr>
+                      <a:picLocks noChangeAspect="1" noChangeArrowheads="1"/>
+                    </pic:cNvPicPr>
+                  </pic:nvPicPr>
+                  <pic:blipFill>
+                    <a:blip r:embed="rId12" cstate="print">
+                      <a:extLst>
+                        <a:ext uri="{28A0092B-C50C-407E-A947-70E740481C1C}">
+                          <a14:useLocalDpi xmlns:a14="http://schemas.microsoft.com/office/drawing/2010/main" val="0"/>
+                        </a:ext>
+                      </a:extLst>
+                    </a:blip>
+                    <a:srcRect/>
+                    <a:stretch>
+                      <a:fillRect/>
+                    </a:stretch>
+                  </pic:blipFill>
+                  <pic:spPr bwMode="auto">
+                    <a:xfrm>
+                      <a:off x="0" y="0"/>
+                      <a:ext cx="5841035" cy="5811886"/>
+                    </a:xfrm>
+                    <a:prstGeom prst="rect">
+                      <a:avLst/>
+                    </a:prstGeom>
+                    <a:noFill/>
+                    <a:ln>
+                      <a:noFill/>
+                    </a:ln>
+                  </pic:spPr>
+                </pic:pic>
+              </a:graphicData>
+            </a:graphic>
+          </wp:inline>
+        </w:drawing>
+      </w:r>
+    </w:p>
+    <w:p>
+      <w:pPr>
+        <w:spacing w:after="120" w:line="300" w:lineRule="auto"/>
+        <w:ind w:left="504" w:hanging="504"/>
+        <w:rPr>
+          <w:b/>
+          <w:bCs/>
+          <w:color w:val="000000" w:themeColor="text1"/>
+        </w:rPr>
+      </w:pPr>
+    </w:p>
+    <w:p>
+      <w:pPr>
+        <w:spacing w:after="120" w:line="300" w:lineRule="auto"/>
+        <w:ind w:left="504" w:hanging="504"/>
         <w:rPr>
           <w:b/>
           <w:bCs/>
           <w:color w:val="000000" w:themeColor="text1"/>
           <w:lang w:val="en-US"/>
         </w:rPr>
-        <w:t>6.2. Danh sách các thông điệp (Messages)</w:t>
-      </w:r>
-    </w:p>
-    <w:p>
-      <w:pPr>
-        <w:spacing w:after="120" w:line="300" w:lineRule="auto"/>
-        <w:ind w:left="504" w:hanging="504"/>
-        <w:jc w:val="both"/>
-        <w:rPr>
-          <w:color w:val="000000" w:themeColor="text1"/>
-          <w:lang w:val="en-US"/>
-        </w:rPr>
-      </w:pPr>
-      <w:r>
-        <w:rPr>
-          <w:color w:val="000000" w:themeColor="text1"/>
-          <w:lang w:val="en-US"/>
-        </w:rPr>
-        <w:t>1.  NhanVien -&gt; FrmPhieuGhiNo: moFormLapPhieuGhiNo(soHD)</w:t>
-      </w:r>
-    </w:p>
-    <w:p>
-      <w:pPr>
-        <w:spacing w:after="120" w:line="300" w:lineRule="auto"/>
-        <w:ind w:left="504" w:hanging="504"/>
-        <w:jc w:val="both"/>
-        <w:rPr>
-          <w:color w:val="000000" w:themeColor="text1"/>
-          <w:lang w:val="en-US"/>
-        </w:rPr>
-      </w:pPr>
-      <w:r>
-        <w:rPr>
-          <w:color w:val="000000" w:themeColor="text1"/>
-          <w:lang w:val="en-US"/>
-        </w:rPr>
-        <w:t>2.  FrmPhieuGhiNo -&gt; GhiNoController: layThongTinHoaDonVaKhach(soHD)</w:t>
-      </w:r>
-    </w:p>
-    <w:p>
-      <w:pPr>
-        <w:spacing w:after="120" w:line="300" w:lineRule="auto"/>
-        <w:ind w:left="504" w:hanging="504"/>
-        <w:jc w:val="both"/>
-        <w:rPr>
-          <w:color w:val="000000" w:themeColor="text1"/>
-          <w:lang w:val="en-US"/>
-        </w:rPr>
-      </w:pPr>
-      <w:r>
-        <w:rPr>
-          <w:color w:val="000000" w:themeColor="text1"/>
-          <w:lang w:val="en-US"/>
-        </w:rPr>
-        <w:t>3.  GhiNoController -&gt; HoaDon: getThongTinHoaDon(soHD)</w:t>
-      </w:r>
-    </w:p>
-    <w:p>
-      <w:pPr>
-        <w:spacing w:after="120" w:line="300" w:lineRule="auto"/>
-        <w:ind w:left="504" w:hanging="504"/>
-        <w:jc w:val="both"/>
-        <w:rPr>
-          <w:color w:val="000000" w:themeColor="text1"/>
-          <w:lang w:val="en-US"/>
-        </w:rPr>
-      </w:pPr>
-      <w:r>
-        <w:rPr>
-          <w:color w:val="000000" w:themeColor="text1"/>
-          <w:lang w:val="en-US"/>
-        </w:rPr>
-        <w:t>4.  HoaDon --&gt; GhiNoController: return thongTinHoaDon (tongTien, maKH, trangThai)</w:t>
-      </w:r>
-    </w:p>
-    <w:p>
-      <w:pPr>
-        <w:spacing w:after="120" w:line="300" w:lineRule="auto"/>
-        <w:ind w:left="504" w:hanging="504"/>
-        <w:jc w:val="both"/>
-        <w:rPr>
-          <w:color w:val="000000" w:themeColor="text1"/>
-          <w:lang w:val="en-US"/>
-        </w:rPr>
-      </w:pPr>
-      <w:r>
-        <w:rPr>
-          <w:color w:val="000000" w:themeColor="text1"/>
-          <w:lang w:val="en-US"/>
-        </w:rPr>
-        <w:t>5.  GhiNoController -&gt; KhachHang: getLoaiKhachHang(maKH)</w:t>
-      </w:r>
-    </w:p>
-    <w:p>
-      <w:pPr>
-        <w:spacing w:after="120" w:line="300" w:lineRule="auto"/>
-        <w:ind w:left="504" w:hanging="504"/>
-        <w:jc w:val="both"/>
-        <w:rPr>
-          <w:color w:val="000000" w:themeColor="text1"/>
-          <w:lang w:val="en-US"/>
-        </w:rPr>
-      </w:pPr>
-      <w:r>
-        <w:rPr>
-          <w:color w:val="000000" w:themeColor="text1"/>
-          <w:lang w:val="en-US"/>
-        </w:rPr>
-        <w:t>6.  KhachHang --&gt; GhiNoController: return loaiKhach ('Quen')</w:t>
-      </w:r>
-    </w:p>
-    <w:p>
-      <w:pPr>
-        <w:spacing w:after="120" w:line="300" w:lineRule="auto"/>
-        <w:ind w:left="504" w:hanging="504"/>
-        <w:jc w:val="both"/>
-        <w:rPr>
-          <w:color w:val="000000" w:themeColor="text1"/>
-          <w:lang w:val="en-US"/>
-        </w:rPr>
-      </w:pPr>
-      <w:r>
-        <w:rPr>
-          <w:color w:val="000000" w:themeColor="text1"/>
-          <w:lang w:val="en-US"/>
-        </w:rPr>
-        <w:t>7.  GhiNoController --&gt; FrmPhieuGhiNo: hienThiThongTinNhanHieu(thongTinHoaDon, loaiKhach)</w:t>
-      </w:r>
-    </w:p>
-    <w:p>
-      <w:pPr>
-        <w:spacing w:after="120" w:line="300" w:lineRule="auto"/>
-        <w:ind w:left="504" w:hanging="504"/>
-        <w:jc w:val="both"/>
-        <w:rPr>
-          <w:color w:val="000000" w:themeColor="text1"/>
-          <w:lang w:val="en-US"/>
-        </w:rPr>
-      </w:pPr>
-      <w:r>
-        <w:rPr>
-          <w:color w:val="000000" w:themeColor="text1"/>
-          <w:lang w:val="en-US"/>
-        </w:rPr>
-        <w:t>8.  NhanVien -&gt; FrmPhieuGhiNo: nhapThongTinGhiNo(soTienNo, ngayDuKienTra, lyDoNo)</w:t>
-      </w:r>
-    </w:p>
-    <w:p>
-      <w:pPr>
-        <w:spacing w:after="120" w:line="300" w:lineRule="auto"/>
-        <w:ind w:left="504" w:hanging="504"/>
-        <w:jc w:val="both"/>
-        <w:rPr>
-          <w:color w:val="000000" w:themeColor="text1"/>
-          <w:lang w:val="en-US"/>
-        </w:rPr>
-      </w:pPr>
-      <w:r>
-        <w:rPr>
-          <w:color w:val="000000" w:themeColor="text1"/>
-          <w:lang w:val="en-US"/>
-        </w:rPr>
-        <w:t>9.  FrmPhieuGhiNo -&gt; GhiNoController: taoPhieuGhiNo(soHD, maKH, soTienNo, ngayDuKienTra, lyDoNo)</w:t>
-      </w:r>
-    </w:p>
-    <w:p>
-      <w:pPr>
-        <w:spacing w:after="120" w:line="300" w:lineRule="auto"/>
-        <w:ind w:left="504" w:hanging="504"/>
-        <w:jc w:val="both"/>
-        <w:rPr>
-          <w:color w:val="000000" w:themeColor="text1"/>
-          <w:lang w:val="en-US"/>
-        </w:rPr>
-      </w:pPr>
-      <w:r>
-        <w:rPr>
-          <w:color w:val="000000" w:themeColor="text1"/>
-          <w:lang w:val="en-US"/>
-        </w:rPr>
-        <w:t>10. GhiNoController -&gt; PhieuGhiNo: create(soPGN, ngayLap, soTienNo, ngayDuKienTra, lyDoNo, soHD, maKH, maNV)</w:t>
-      </w:r>
-    </w:p>
-    <w:p>
-      <w:pPr>
-        <w:spacing w:after="120" w:line="300" w:lineRule="auto"/>
-        <w:ind w:left="504" w:hanging="504"/>
-        <w:jc w:val="both"/>
-        <w:rPr>
-          <w:color w:val="000000" w:themeColor="text1"/>
-          <w:lang w:val="en-US"/>
-        </w:rPr>
-      </w:pPr>
-      <w:r>
-        <w:rPr>
-          <w:color w:val="000000" w:themeColor="text1"/>
-          <w:lang w:val="en-US"/>
-        </w:rPr>
-        <w:t>11. PhieuGhiNo --&gt; GhiNoController: return soPGN</w:t>
-      </w:r>
-    </w:p>
-    <w:p>
-      <w:pPr>
-        <w:spacing w:after="120" w:line="300" w:lineRule="auto"/>
-        <w:ind w:left="504" w:hanging="504"/>
-        <w:jc w:val="both"/>
-        <w:rPr>
-          <w:color w:val="000000" w:themeColor="text1"/>
-          <w:lang w:val="en-US"/>
-        </w:rPr>
-      </w:pPr>
-      <w:r>
-        <w:rPr>
-          <w:color w:val="000000" w:themeColor="text1"/>
-          <w:lang w:val="en-US"/>
-        </w:rPr>
-        <w:t>12. GhiNoController -&gt; HoaDon: capNhatTrangThaiThanhToan(soHD, 'Ghi no')</w:t>
-      </w:r>
-    </w:p>
-    <w:p>
-      <w:pPr>
-        <w:spacing w:after="120" w:line="300" w:lineRule="auto"/>
-        <w:ind w:left="504" w:hanging="504"/>
-        <w:jc w:val="both"/>
-        <w:rPr>
-          <w:color w:val="000000" w:themeColor="text1"/>
-          <w:lang w:val="en-US"/>
-        </w:rPr>
-      </w:pPr>
-      <w:r>
-        <w:rPr>
-          <w:color w:val="000000" w:themeColor="text1"/>
-          <w:lang w:val="en-US"/>
-        </w:rPr>
-        <w:t>13. HoaDon --&gt; GhiNoController: return success</w:t>
-      </w:r>
-    </w:p>
-    <w:p>
-      <w:pPr>
-        <w:spacing w:after="120" w:line="300" w:lineRule="auto"/>
-        <w:ind w:left="504" w:hanging="504"/>
-        <w:jc w:val="both"/>
-        <w:rPr>
-          <w:color w:val="000000" w:themeColor="text1"/>
-          <w:lang w:val="en-US"/>
-        </w:rPr>
-      </w:pPr>
-      <w:r>
-        <w:rPr>
-          <w:color w:val="000000" w:themeColor="text1"/>
-          <w:lang w:val="en-US"/>
-        </w:rPr>
-        <w:t>14. GhiNoController --&gt; FrmPhieuGhiNo: thongBaoLapPhieuThanhCong(soPGN)</w:t>
-      </w:r>
-    </w:p>
-    <w:p>
-      <w:pPr>
-        <w:spacing w:after="120" w:line="300" w:lineRule="auto"/>
-        <w:ind w:left="504" w:hanging="504"/>
-        <w:jc w:val="both"/>
-        <w:rPr>
-          <w:color w:val="000000" w:themeColor="text1"/>
-        </w:rPr>
-      </w:pPr>
-      <w:r>
-        <w:rPr>
-          <w:color w:val="000000" w:themeColor="text1"/>
-          <w:lang w:val="en-US"/>
-        </w:rPr>
-        <w:t>15. FrmPhieuGhiNo --&gt; NhanVien: hienThiPhieuGhiNoIn(soPGN)</w:t>
-      </w:r>
-    </w:p>
-    <w:p>
-      <w:pPr>
-        <w:spacing w:after="120" w:line="300" w:lineRule="auto"/>
-        <w:ind w:left="504" w:hanging="504"/>
-        <w:jc w:val="both"/>
+      </w:pPr>
+      <w:r>
         <w:rPr>
           <w:b/>
           <w:bCs/>
           <w:color w:val="000000" w:themeColor="text1"/>
           <w:lang w:val="en-US"/>
         </w:rPr>
-      </w:pPr>
+        <w:t>4</w:t>
+      </w:r>
       <w:r>
         <w:rPr>
           <w:b/>
@@ -7938,17 +7743,34 @@
           <w:color w:val="000000" w:themeColor="text1"/>
           <w:lang w:val="en-US"/>
         </w:rPr>
-        <w:t>6.3. Hướng dẫn cách vẽ Sequence Diagram trên StarUML / Draw.io</w:t>
+        <w:t>.</w:t>
+      </w:r>
+      <w:r>
+        <w:rPr>
+          <w:b/>
+          <w:bCs/>
+          <w:color w:val="000000" w:themeColor="text1"/>
+          <w:lang w:val="en-US"/>
+        </w:rPr>
+        <w:t>2</w:t>
+      </w:r>
+      <w:r>
+        <w:rPr>
+          <w:b/>
+          <w:bCs/>
+          <w:color w:val="000000" w:themeColor="text1"/>
+          <w:lang w:val="en-US"/>
+        </w:rPr>
+        <w:t>. Các Ràng buộc CSDL quan trọng</w:t>
       </w:r>
     </w:p>
     <w:p>
       <w:pPr>
         <w:numPr>
           <w:ilvl w:val="0"/>
-          <w:numId w:val="22"/>
+          <w:numId w:val="23"/>
         </w:numPr>
         <w:spacing w:after="120" w:line="300" w:lineRule="auto"/>
-        <w:jc w:val="both"/>
         <w:rPr>
           <w:color w:val="000000" w:themeColor="text1"/>
           <w:lang w:val="en-US"/>
@@ -7956,10 +7778,61 @@
       </w:pPr>
       <w:r>
         <w:rPr>
+          <w:b/>
+          <w:bCs/>
           <w:color w:val="000000" w:themeColor="text1"/>
           <w:lang w:val="en-US"/>
         </w:rPr>
-        <w:t xml:space="preserve">Bố trí 6 Lifelines theo thứ tự ngang từ trái sang phải: :NhanVien </w:t>
+        <w:t>Primary Key (PK):</w:t>
+      </w:r>
+      <w:r>
+        <w:rPr>
+          <w:color w:val="000000" w:themeColor="text1"/>
+          <w:lang w:val="en-US"/>
+        </w:rPr>
+        <w:t xml:space="preserve"> LoaiNGK(maLoaiNGK), NuocGiaiKhat(maNGK), NhaCungCap(maNCC), NhanVien(maNV), KhachHang(maKH), DonDatHang(soDDH), PhieuGiaoHang(soPGH), HoaDon(soHD), PhieuHen(soPhieuHen), PhieuGhiNo(soPGN).</w:t>
+      </w:r>
+    </w:p>
+    <w:p>
+      <w:pPr>
+        <w:numPr>
+          <w:ilvl w:val="0"/>
+          <w:numId w:val="23"/>
+        </w:numPr>
+        <w:spacing w:after="120" w:line="300" w:lineRule="auto"/>
+        <w:rPr>
+          <w:color w:val="000000" w:themeColor="text1"/>
+          <w:lang w:val="en-US"/>
+        </w:rPr>
+      </w:pPr>
+      <w:r>
+        <w:rPr>
+          <w:b/>
+          <w:bCs/>
+          <w:color w:val="000000" w:themeColor="text1"/>
+          <w:lang w:val="en-US"/>
+        </w:rPr>
+        <w:t>Foreign Key (FK):</w:t>
+      </w:r>
+    </w:p>
+    <w:p>
+      <w:pPr>
+        <w:numPr>
+          <w:ilvl w:val="1"/>
+          <w:numId w:val="23"/>
+        </w:numPr>
+        <w:spacing w:after="120" w:line="300" w:lineRule="auto"/>
+        <w:rPr>
+          <w:color w:val="000000" w:themeColor="text1"/>
+          <w:lang w:val="en-US"/>
+        </w:rPr>
+      </w:pPr>
+      <w:r>
+        <w:rPr>
+          <w:color w:val="000000" w:themeColor="text1"/>
+          <w:lang w:val="en-US"/>
+        </w:rPr>
+        <w:t xml:space="preserve">NuocGiaiKhat.maLoaiNGK </w:t>
       </w:r>
       <m:oMath>
         <m:r>
@@ -7976,7 +7849,27 @@
           <w:color w:val="000000" w:themeColor="text1"/>
           <w:lang w:val="en-US"/>
         </w:rPr>
-        <w:t xml:space="preserve"> :FrmPhieuGhiNo </w:t>
+        <w:t xml:space="preserve"> LoaiNGK.maLoaiNGK</w:t>
+      </w:r>
+    </w:p>
+    <w:p>
+      <w:pPr>
+        <w:numPr>
+          <w:ilvl w:val="1"/>
+          <w:numId w:val="23"/>
+        </w:numPr>
+        <w:spacing w:after="120" w:line="300" w:lineRule="auto"/>
+        <w:rPr>
+          <w:color w:val="000000" w:themeColor="text1"/>
+          <w:lang w:val="en-US"/>
+        </w:rPr>
+      </w:pPr>
+      <w:r>
+        <w:rPr>
+          <w:color w:val="000000" w:themeColor="text1"/>
+          <w:lang w:val="en-US"/>
+        </w:rPr>
+        <w:t xml:space="preserve">NuocGiaiKhat.maNCC </w:t>
       </w:r>
       <m:oMath>
         <m:r>
@@ -7993,7 +7886,27 @@
           <w:color w:val="000000" w:themeColor="text1"/>
           <w:lang w:val="en-US"/>
         </w:rPr>
-        <w:t xml:space="preserve"> :GhiNoController </w:t>
+        <w:t xml:space="preserve"> NhaCungCap.maNCC</w:t>
+      </w:r>
+    </w:p>
+    <w:p>
+      <w:pPr>
+        <w:numPr>
+          <w:ilvl w:val="1"/>
+          <w:numId w:val="23"/>
+        </w:numPr>
+        <w:spacing w:after="120" w:line="300" w:lineRule="auto"/>
+        <w:rPr>
+          <w:color w:val="000000" w:themeColor="text1"/>
+          <w:lang w:val="en-US"/>
+        </w:rPr>
+      </w:pPr>
+      <w:r>
+        <w:rPr>
+          <w:color w:val="000000" w:themeColor="text1"/>
+          <w:lang w:val="en-US"/>
+        </w:rPr>
+        <w:t xml:space="preserve">DonDatHang.maNCC </w:t>
       </w:r>
       <m:oMath>
         <m:r>
@@ -8010,7 +7923,27 @@
           <w:color w:val="000000" w:themeColor="text1"/>
           <w:lang w:val="en-US"/>
         </w:rPr>
-        <w:t xml:space="preserve"> :KhachHang </w:t>
+        <w:t xml:space="preserve"> NhaCungCap.maNCC</w:t>
+      </w:r>
+    </w:p>
+    <w:p>
+      <w:pPr>
+        <w:numPr>
+          <w:ilvl w:val="1"/>
+          <w:numId w:val="23"/>
+        </w:numPr>
+        <w:spacing w:after="120" w:line="300" w:lineRule="auto"/>
+        <w:rPr>
+          <w:color w:val="000000" w:themeColor="text1"/>
+          <w:lang w:val="en-US"/>
+        </w:rPr>
+      </w:pPr>
+      <w:r>
+        <w:rPr>
+          <w:color w:val="000000" w:themeColor="text1"/>
+          <w:lang w:val="en-US"/>
+        </w:rPr>
+        <w:t xml:space="preserve">DonDatHang.maNV </w:t>
       </w:r>
       <m:oMath>
         <m:r>
@@ -8027,7 +7960,27 @@
           <w:color w:val="000000" w:themeColor="text1"/>
           <w:lang w:val="en-US"/>
         </w:rPr>
-        <w:t xml:space="preserve"> :HoaDon </w:t>
+        <w:t xml:space="preserve"> NhanVien.maNV</w:t>
+      </w:r>
+    </w:p>
+    <w:p>
+      <w:pPr>
+        <w:numPr>
+          <w:ilvl w:val="1"/>
+          <w:numId w:val="23"/>
+        </w:numPr>
+        <w:spacing w:after="120" w:line="300" w:lineRule="auto"/>
+        <w:rPr>
+          <w:color w:val="000000" w:themeColor="text1"/>
+          <w:lang w:val="en-US"/>
+        </w:rPr>
+      </w:pPr>
+      <w:r>
+        <w:rPr>
+          <w:color w:val="000000" w:themeColor="text1"/>
+          <w:lang w:val="en-US"/>
+        </w:rPr>
+        <w:t xml:space="preserve">PhieuGiaoHang.soDDH </w:t>
       </w:r>
       <m:oMath>
         <m:r>
@@ -8044,195 +7997,7 @@
           <w:color w:val="000000" w:themeColor="text1"/>
           <w:lang w:val="en-US"/>
         </w:rPr>
-        <w:t xml:space="preserve"> :PhieuGhiNo.</w:t>
-      </w:r>
-    </w:p>
-    <w:p>
-      <w:pPr>
-        <w:numPr>
-          <w:ilvl w:val="0"/>
-          <w:numId w:val="22"/>
-        </w:numPr>
-        <w:spacing w:after="120" w:line="300" w:lineRule="auto"/>
-        <w:jc w:val="both"/>
-        <w:rPr>
-          <w:color w:val="000000" w:themeColor="text1"/>
-          <w:lang w:val="en-US"/>
-        </w:rPr>
-      </w:pPr>
-      <w:r>
-        <w:rPr>
-          <w:color w:val="000000" w:themeColor="text1"/>
-          <w:lang w:val="en-US"/>
-        </w:rPr>
-        <w:t xml:space="preserve">Nối các thông điệp đồng bộ (Synchronous Message) bằng </w:t>
-      </w:r>
-      <w:r>
-        <w:rPr>
-          <w:b/>
-          <w:bCs/>
-          <w:color w:val="000000" w:themeColor="text1"/>
-          <w:lang w:val="en-US"/>
-        </w:rPr>
-        <w:t>mũi tên nét liền đầu đặc</w:t>
-      </w:r>
-      <w:r>
-        <w:rPr>
-          <w:color w:val="000000" w:themeColor="text1"/>
-          <w:lang w:val="en-US"/>
-        </w:rPr>
-        <w:t xml:space="preserve"> hướng từ trái sang phải.</w:t>
-      </w:r>
-    </w:p>
-    <w:p>
-      <w:pPr>
-        <w:numPr>
-          <w:ilvl w:val="0"/>
-          <w:numId w:val="22"/>
-        </w:numPr>
-        <w:spacing w:after="120" w:line="300" w:lineRule="auto"/>
-        <w:jc w:val="both"/>
-        <w:rPr>
-          <w:color w:val="000000" w:themeColor="text1"/>
-          <w:lang w:val="en-US"/>
-        </w:rPr>
-      </w:pPr>
-      <w:r>
-        <w:rPr>
-          <w:color w:val="000000" w:themeColor="text1"/>
-          <w:lang w:val="en-US"/>
-        </w:rPr>
-        <w:t xml:space="preserve">Nối các thông điệp phản hồi (Return Message) bằng </w:t>
-      </w:r>
-      <w:r>
-        <w:rPr>
-          <w:b/>
-          <w:bCs/>
-          <w:color w:val="000000" w:themeColor="text1"/>
-          <w:lang w:val="en-US"/>
-        </w:rPr>
-        <w:t>mũi tên nét đứt</w:t>
-      </w:r>
-      <w:r>
-        <w:rPr>
-          <w:color w:val="000000" w:themeColor="text1"/>
-          <w:lang w:val="en-US"/>
-        </w:rPr>
-        <w:t xml:space="preserve"> hướng ngược lại từ phải sang trái.</w:t>
-      </w:r>
-    </w:p>
-    <w:p>
-      <w:pPr>
-        <w:numPr>
-          <w:ilvl w:val="0"/>
-          <w:numId w:val="22"/>
-        </w:numPr>
-        <w:spacing w:after="120" w:line="300" w:lineRule="auto"/>
-        <w:jc w:val="both"/>
-        <w:rPr>
-          <w:color w:val="000000" w:themeColor="text1"/>
-          <w:lang w:val="en-US"/>
-        </w:rPr>
-      </w:pPr>
-      <w:r>
-        <w:rPr>
-          <w:color w:val="000000" w:themeColor="text1"/>
-          <w:lang w:val="en-US"/>
-        </w:rPr>
-        <w:t>Vẽ các hình chữ nhật dọc nhỏ (Activation bar) thể hiện thời gian sống/xử lý của đối tượng tương ứng với từng thông điệp.</w:t>
-      </w:r>
-    </w:p>
-    <w:p>
-      <w:pPr>
-        <w:spacing w:after="120" w:line="300" w:lineRule="auto"/>
-        <w:ind w:left="504" w:hanging="504"/>
-        <w:rPr>
-          <w:b/>
-          <w:bCs/>
-          <w:color w:val="000000" w:themeColor="text1"/>
-        </w:rPr>
-      </w:pPr>
-      <w:r>
-        <w:rPr>
-          <w:b/>
-          <w:bCs/>
-          <w:color w:val="000000" w:themeColor="text1"/>
-          <w:lang w:val="en-US"/>
-        </w:rPr>
-        <w:t>3. BỔ SUNG RÀNG BUỘC CSDL VÀ THIẾT KẾ GIAO DIỆN</w:t>
-      </w:r>
-    </w:p>
-    <w:p>
-      <w:pPr>
-        <w:spacing w:after="120" w:line="300" w:lineRule="auto"/>
-        <w:ind w:left="504" w:hanging="504"/>
-        <w:rPr>
-          <w:b/>
-          <w:bCs/>
-          <w:color w:val="000000" w:themeColor="text1"/>
-          <w:lang w:val="en-US"/>
-        </w:rPr>
-      </w:pPr>
-      <w:r>
-        <w:rPr>
-          <w:b/>
-          <w:bCs/>
-          <w:color w:val="000000" w:themeColor="text1"/>
-          <w:lang w:val="en-US"/>
-        </w:rPr>
-        <w:t>3.1. Các Ràng buộc CSDL quan trọng</w:t>
-      </w:r>
-    </w:p>
-    <w:p>
-      <w:pPr>
-        <w:numPr>
-          <w:ilvl w:val="0"/>
-          <w:numId w:val="23"/>
-        </w:numPr>
-        <w:spacing w:after="120" w:line="300" w:lineRule="auto"/>
-        <w:rPr>
-          <w:color w:val="000000" w:themeColor="text1"/>
-          <w:lang w:val="en-US"/>
-        </w:rPr>
-      </w:pPr>
-      <w:r>
-        <w:rPr>
-          <w:b/>
-          <w:bCs/>
-          <w:color w:val="000000" w:themeColor="text1"/>
-          <w:lang w:val="en-US"/>
-        </w:rPr>
-        <w:lastRenderedPageBreak/>
-        <w:t>Primary Key (PK):</w:t>
-      </w:r>
-      <w:r>
-        <w:rPr>
-          <w:color w:val="000000" w:themeColor="text1"/>
-          <w:lang w:val="en-US"/>
-        </w:rPr>
-        <w:t xml:space="preserve"> LoaiNGK(maLoaiNGK), NuocGiaiKhat(maNGK), NhaCungCap(maNCC), NhanVien(maNV), KhachHang(maKH), DonDatHang(soDDH), PhieuGiaoHang(soPGH), HoaDon(soHD), PhieuHen(soPhieuHen), PhieuGhiNo(soPGN).</w:t>
-      </w:r>
-    </w:p>
-    <w:p>
-      <w:pPr>
-        <w:numPr>
-          <w:ilvl w:val="0"/>
-          <w:numId w:val="23"/>
-        </w:numPr>
-        <w:spacing w:after="120" w:line="300" w:lineRule="auto"/>
-        <w:rPr>
-          <w:color w:val="000000" w:themeColor="text1"/>
-          <w:lang w:val="en-US"/>
-        </w:rPr>
-      </w:pPr>
-      <w:r>
-        <w:rPr>
-          <w:b/>
-          <w:bCs/>
-          <w:color w:val="000000" w:themeColor="text1"/>
-          <w:lang w:val="en-US"/>
-        </w:rPr>
-        <w:t>Foreign Key (FK):</w:t>
+        <w:t xml:space="preserve"> DonDatHang.soDDH</w:t>
       </w:r>
     </w:p>
     <w:p>
@@ -8252,7 +8017,8 @@
           <w:color w:val="000000" w:themeColor="text1"/>
           <w:lang w:val="en-US"/>
         </w:rPr>
-        <w:t xml:space="preserve">NuocGiaiKhat.maLoaiNGK </w:t>
+        <w:lastRenderedPageBreak/>
+        <w:t xml:space="preserve">HoaDon.maKH </w:t>
       </w:r>
       <m:oMath>
         <m:r>
@@ -8269,7 +8035,7 @@
           <w:color w:val="000000" w:themeColor="text1"/>
           <w:lang w:val="en-US"/>
         </w:rPr>
-        <w:t xml:space="preserve"> LoaiNGK.maLoaiNGK</w:t>
+        <w:t xml:space="preserve"> KhachHang.maKH</w:t>
       </w:r>
     </w:p>
     <w:p>
@@ -8289,7 +8055,7 @@
           <w:color w:val="000000" w:themeColor="text1"/>
           <w:lang w:val="en-US"/>
         </w:rPr>
-        <w:t xml:space="preserve">NuocGiaiKhat.maNCC </w:t>
+        <w:t xml:space="preserve">HoaDon.maNV </w:t>
       </w:r>
       <m:oMath>
         <m:r>
@@ -8306,7 +8072,7 @@
           <w:color w:val="000000" w:themeColor="text1"/>
           <w:lang w:val="en-US"/>
         </w:rPr>
-        <w:t xml:space="preserve"> NhaCungCap.maNCC</w:t>
+        <w:t xml:space="preserve"> NhanVien.maNV</w:t>
       </w:r>
     </w:p>
     <w:p>
@@ -8326,7 +8092,7 @@
           <w:color w:val="000000" w:themeColor="text1"/>
           <w:lang w:val="en-US"/>
         </w:rPr>
-        <w:t xml:space="preserve">DonDatHang.maNCC </w:t>
+        <w:t xml:space="preserve">PhieuHen.soHD </w:t>
       </w:r>
       <m:oMath>
         <m:r>
@@ -8343,7 +8109,7 @@
           <w:color w:val="000000" w:themeColor="text1"/>
           <w:lang w:val="en-US"/>
         </w:rPr>
-        <w:t xml:space="preserve"> NhaCungCap.maNCC</w:t>
+        <w:t xml:space="preserve"> HoaDon.soHD</w:t>
       </w:r>
     </w:p>
     <w:p>
@@ -8363,7 +8129,7 @@
           <w:color w:val="000000" w:themeColor="text1"/>
           <w:lang w:val="en-US"/>
         </w:rPr>
-        <w:t xml:space="preserve">DonDatHang.maNV </w:t>
+        <w:t xml:space="preserve">PhieuGhiNo.soHD </w:t>
       </w:r>
       <m:oMath>
         <m:r>
@@ -8380,7 +8146,7 @@
           <w:color w:val="000000" w:themeColor="text1"/>
           <w:lang w:val="en-US"/>
         </w:rPr>
-        <w:t xml:space="preserve"> NhanVien.maNV</w:t>
+        <w:t xml:space="preserve"> HoaDon.soHD</w:t>
       </w:r>
     </w:p>
     <w:p>
@@ -8400,7 +8166,7 @@
           <w:color w:val="000000" w:themeColor="text1"/>
           <w:lang w:val="en-US"/>
         </w:rPr>
-        <w:t xml:space="preserve">PhieuGiaoHang.soDDH </w:t>
+        <w:t xml:space="preserve">PhieuGhiNo.maKH </w:t>
       </w:r>
       <m:oMath>
         <m:r>
@@ -8417,7 +8183,29 @@
           <w:color w:val="000000" w:themeColor="text1"/>
           <w:lang w:val="en-US"/>
         </w:rPr>
-        <w:t xml:space="preserve"> DonDatHang.soDDH</w:t>
+        <w:t xml:space="preserve"> KhachHang.maKH</w:t>
+      </w:r>
+    </w:p>
+    <w:p>
+      <w:pPr>
+        <w:numPr>
+          <w:ilvl w:val="0"/>
+          <w:numId w:val="23"/>
+        </w:numPr>
+        <w:spacing w:after="120" w:line="300" w:lineRule="auto"/>
+        <w:rPr>
+          <w:color w:val="000000" w:themeColor="text1"/>
+          <w:lang w:val="en-US"/>
+        </w:rPr>
+      </w:pPr>
+      <w:r>
+        <w:rPr>
+          <w:b/>
+          <w:bCs/>
+          <w:color w:val="000000" w:themeColor="text1"/>
+          <w:lang w:val="en-US"/>
+        </w:rPr>
+        <w:t>CHECK Constraints:</w:t>
       </w:r>
     </w:p>
     <w:p>
@@ -8437,24 +8225,7 @@
           <w:color w:val="000000" w:themeColor="text1"/>
           <w:lang w:val="en-US"/>
         </w:rPr>
-        <w:t xml:space="preserve">HoaDon.maKH </w:t>
-      </w:r>
-      <m:oMath>
-        <m:r>
-          <w:rPr>
-            <w:rFonts w:ascii="Cambria Math" w:hAnsi="Cambria Math"/>
-            <w:color w:val="000000" w:themeColor="text1"/>
-            <w:lang w:val="en-US"/>
-          </w:rPr>
-          <m:t>→</m:t>
-        </m:r>
-      </m:oMath>
-      <w:r>
-        <w:rPr>
-          <w:color w:val="000000" w:themeColor="text1"/>
-          <w:lang w:val="en-US"/>
-        </w:rPr>
-        <w:t xml:space="preserve"> KhachHang.maKH</w:t>
+        <w:t>PhieuGiaoHang.dotGiao IN (1, 2, 3) (Một ĐĐH tối đa 3 đợt).</w:t>
       </w:r>
     </w:p>
     <w:p>
@@ -8474,24 +8245,7 @@
           <w:color w:val="000000" w:themeColor="text1"/>
           <w:lang w:val="en-US"/>
         </w:rPr>
-        <w:t xml:space="preserve">HoaDon.maNV </w:t>
-      </w:r>
-      <m:oMath>
-        <m:r>
-          <w:rPr>
-            <w:rFonts w:ascii="Cambria Math" w:hAnsi="Cambria Math"/>
-            <w:color w:val="000000" w:themeColor="text1"/>
-            <w:lang w:val="en-US"/>
-          </w:rPr>
-          <m:t>→</m:t>
-        </m:r>
-      </m:oMath>
-      <w:r>
-        <w:rPr>
-          <w:color w:val="000000" w:themeColor="text1"/>
-          <w:lang w:val="en-US"/>
-        </w:rPr>
-        <w:t xml:space="preserve"> NhanVien.maNV</w:t>
+        <w:t>KhachHang.loaiKhach IN ('Quen', 'VangLai').</w:t>
       </w:r>
     </w:p>
     <w:p>
@@ -8511,24 +8265,7 @@
           <w:color w:val="000000" w:themeColor="text1"/>
           <w:lang w:val="en-US"/>
         </w:rPr>
-        <w:t xml:space="preserve">PhieuHen.soHD </w:t>
-      </w:r>
-      <m:oMath>
-        <m:r>
-          <w:rPr>
-            <w:rFonts w:ascii="Cambria Math" w:hAnsi="Cambria Math"/>
-            <w:color w:val="000000" w:themeColor="text1"/>
-            <w:lang w:val="en-US"/>
-          </w:rPr>
-          <m:t>→</m:t>
-        </m:r>
-      </m:oMath>
-      <w:r>
-        <w:rPr>
-          <w:color w:val="000000" w:themeColor="text1"/>
-          <w:lang w:val="en-US"/>
-        </w:rPr>
-        <w:t xml:space="preserve"> HoaDon.soHD</w:t>
+        <w:t>NuocGiaiKhat.soLuongTon &gt;= 0.</w:t>
       </w:r>
     </w:p>
     <w:p>
@@ -8548,73 +8285,17 @@
           <w:color w:val="000000" w:themeColor="text1"/>
           <w:lang w:val="en-US"/>
         </w:rPr>
-        <w:t xml:space="preserve">PhieuGhiNo.soHD </w:t>
-      </w:r>
-      <m:oMath>
-        <m:r>
-          <w:rPr>
-            <w:rFonts w:ascii="Cambria Math" w:hAnsi="Cambria Math"/>
-            <w:color w:val="000000" w:themeColor="text1"/>
-            <w:lang w:val="en-US"/>
-          </w:rPr>
-          <m:t>→</m:t>
-        </m:r>
-      </m:oMath>
-      <w:r>
-        <w:rPr>
-          <w:color w:val="000000" w:themeColor="text1"/>
-          <w:lang w:val="en-US"/>
-        </w:rPr>
-        <w:t xml:space="preserve"> HoaDon.soHD</w:t>
+        <w:t>PhieuGhiNo.soTienNo &gt; 0.</w:t>
       </w:r>
     </w:p>
     <w:p>
       <w:pPr>
-        <w:numPr>
-          <w:ilvl w:val="1"/>
-          <w:numId w:val="23"/>
-        </w:numPr>
         <w:spacing w:after="120" w:line="300" w:lineRule="auto"/>
-        <w:rPr>
+        <w:ind w:left="504" w:hanging="504"/>
+        <w:rPr>
+          <w:b/>
+          <w:bCs/>
           <w:color w:val="000000" w:themeColor="text1"/>
-          <w:lang w:val="en-US"/>
-        </w:rPr>
-      </w:pPr>
-      <w:r>
-        <w:rPr>
-          <w:color w:val="000000" w:themeColor="text1"/>
-          <w:lang w:val="en-US"/>
-        </w:rPr>
-        <w:t xml:space="preserve">PhieuGhiNo.maKH </w:t>
-      </w:r>
-      <m:oMath>
-        <m:r>
-          <w:rPr>
-            <w:rFonts w:ascii="Cambria Math" w:hAnsi="Cambria Math"/>
-            <w:color w:val="000000" w:themeColor="text1"/>
-            <w:lang w:val="en-US"/>
-          </w:rPr>
-          <m:t>→</m:t>
-        </m:r>
-      </m:oMath>
-      <w:r>
-        <w:rPr>
-          <w:color w:val="000000" w:themeColor="text1"/>
-          <w:lang w:val="en-US"/>
-        </w:rPr>
-        <w:t xml:space="preserve"> KhachHang.maKH</w:t>
-      </w:r>
-    </w:p>
-    <w:p>
-      <w:pPr>
-        <w:numPr>
-          <w:ilvl w:val="0"/>
-          <w:numId w:val="23"/>
-        </w:numPr>
-        <w:spacing w:after="120" w:line="300" w:lineRule="auto"/>
-        <w:rPr>
-          <w:color w:val="000000" w:themeColor="text1"/>
-          <w:lang w:val="en-US"/>
         </w:rPr>
       </w:pPr>
       <w:r>
@@ -8624,99 +8305,8 @@
           <w:color w:val="000000" w:themeColor="text1"/>
           <w:lang w:val="en-US"/>
         </w:rPr>
-        <w:t>CHECK Constraints:</w:t>
-      </w:r>
-    </w:p>
-    <w:p>
-      <w:pPr>
-        <w:numPr>
-          <w:ilvl w:val="1"/>
-          <w:numId w:val="23"/>
-        </w:numPr>
-        <w:spacing w:after="120" w:line="300" w:lineRule="auto"/>
-        <w:rPr>
-          <w:color w:val="000000" w:themeColor="text1"/>
-          <w:lang w:val="en-US"/>
-        </w:rPr>
-      </w:pPr>
-      <w:r>
-        <w:rPr>
-          <w:color w:val="000000" w:themeColor="text1"/>
-          <w:lang w:val="en-US"/>
-        </w:rPr>
-        <w:t>PhieuGiaoHang.dotGiao IN (1, 2, 3) (Một ĐĐH tối đa 3 đợt).</w:t>
-      </w:r>
-    </w:p>
-    <w:p>
-      <w:pPr>
-        <w:numPr>
-          <w:ilvl w:val="1"/>
-          <w:numId w:val="23"/>
-        </w:numPr>
-        <w:spacing w:after="120" w:line="300" w:lineRule="auto"/>
-        <w:rPr>
-          <w:color w:val="000000" w:themeColor="text1"/>
-          <w:lang w:val="en-US"/>
-        </w:rPr>
-      </w:pPr>
-      <w:r>
-        <w:rPr>
-          <w:color w:val="000000" w:themeColor="text1"/>
-          <w:lang w:val="en-US"/>
-        </w:rPr>
-        <w:t>KhachHang.loaiKhach IN ('Quen', 'VangLai').</w:t>
-      </w:r>
-    </w:p>
-    <w:p>
-      <w:pPr>
-        <w:numPr>
-          <w:ilvl w:val="1"/>
-          <w:numId w:val="23"/>
-        </w:numPr>
-        <w:spacing w:after="120" w:line="300" w:lineRule="auto"/>
-        <w:rPr>
-          <w:color w:val="000000" w:themeColor="text1"/>
-          <w:lang w:val="en-US"/>
-        </w:rPr>
-      </w:pPr>
-      <w:r>
-        <w:rPr>
-          <w:color w:val="000000" w:themeColor="text1"/>
-          <w:lang w:val="en-US"/>
-        </w:rPr>
-        <w:t>NuocGiaiKhat.soLuongTon &gt;= 0.</w:t>
-      </w:r>
-    </w:p>
-    <w:p>
-      <w:pPr>
-        <w:numPr>
-          <w:ilvl w:val="1"/>
-          <w:numId w:val="23"/>
-        </w:numPr>
-        <w:spacing w:after="120" w:line="300" w:lineRule="auto"/>
-        <w:rPr>
-          <w:color w:val="000000" w:themeColor="text1"/>
-          <w:lang w:val="en-US"/>
-        </w:rPr>
-      </w:pPr>
-      <w:r>
-        <w:rPr>
-          <w:color w:val="000000" w:themeColor="text1"/>
-          <w:lang w:val="en-US"/>
-        </w:rPr>
-        <w:t>PhieuGhiNo.soTienNo &gt; 0.</w:t>
-      </w:r>
-    </w:p>
-    <w:p>
-      <w:pPr>
-        <w:spacing w:after="120" w:line="300" w:lineRule="auto"/>
-        <w:ind w:left="504" w:hanging="504"/>
-        <w:rPr>
-          <w:b/>
-          <w:bCs/>
-          <w:color w:val="000000" w:themeColor="text1"/>
-        </w:rPr>
-      </w:pPr>
+        <w:t>5</w:t>
+      </w:r>
       <w:r>
         <w:rPr>
           <w:b/>
@@ -8724,7 +8314,24 @@
           <w:color w:val="000000" w:themeColor="text1"/>
           <w:lang w:val="en-US"/>
         </w:rPr>
-        <w:t>3.2. Thiết kế Form</w:t>
+        <w:t xml:space="preserve">. </w:t>
+      </w:r>
+      <w:r>
+        <w:rPr>
+          <w:b/>
+          <w:bCs/>
+          <w:color w:val="000000" w:themeColor="text1"/>
+          <w:lang w:val="en-US"/>
+        </w:rPr>
+        <w:t>THIẾT</w:t>
+      </w:r>
+      <w:r>
+        <w:rPr>
+          <w:b/>
+          <w:bCs/>
+          <w:color w:val="000000" w:themeColor="text1"/>
+        </w:rPr>
+        <w:t xml:space="preserve"> KẾ GIAO DIỆN</w:t>
       </w:r>
     </w:p>
     <w:p>
@@ -8755,7 +8362,6 @@
         <w:spacing w:after="120" w:line="300" w:lineRule="auto"/>
         <w:rPr>
           <w:color w:val="000000" w:themeColor="text1"/>
-          <w:lang w:val="en-US"/>
         </w:rPr>
       </w:pPr>
       <w:r>
@@ -8763,14 +8369,12 @@
           <w:b/>
           <w:bCs/>
           <w:color w:val="000000" w:themeColor="text1"/>
-          <w:lang w:val="en-US"/>
         </w:rPr>
         <w:t>Mục đích:</w:t>
       </w:r>
       <w:r>
         <w:rPr>
           <w:color w:val="000000" w:themeColor="text1"/>
-          <w:lang w:val="en-US"/>
         </w:rPr>
         <w:t xml:space="preserve"> Giao diện điều hướng trung tâm quản lý các phân hệ của cửa hàng nước giải khát.</w:t>
       </w:r>
@@ -8784,7 +8388,6 @@
         <w:spacing w:after="120" w:line="300" w:lineRule="auto"/>
         <w:rPr>
           <w:color w:val="000000" w:themeColor="text1"/>
-          <w:lang w:val="en-US"/>
         </w:rPr>
       </w:pPr>
       <w:r>
@@ -8792,14 +8395,12 @@
           <w:b/>
           <w:bCs/>
           <w:color w:val="000000" w:themeColor="text1"/>
-          <w:lang w:val="en-US"/>
         </w:rPr>
         <w:t>Đối tượng sử dụng:</w:t>
       </w:r>
       <w:r>
         <w:rPr>
           <w:color w:val="000000" w:themeColor="text1"/>
-          <w:lang w:val="en-US"/>
         </w:rPr>
         <w:t xml:space="preserve"> Quản lý Cửa hàng, Nhân viên Cửa hàng.</w:t>
       </w:r>
@@ -9229,7 +8830,6 @@
                 <w:color w:val="000000" w:themeColor="text1"/>
                 <w:lang w:val="en-US"/>
               </w:rPr>
-              <w:lastRenderedPageBreak/>
               <w:t>btnNhapHang_NCC</w:t>
             </w:r>
           </w:p>
@@ -9606,6 +9206,7 @@
           <w:color w:val="000000" w:themeColor="text1"/>
           <w:lang w:val="en-US"/>
         </w:rPr>
+        <w:lastRenderedPageBreak/>
         <w:t>Danh sách Controls chính:</w:t>
       </w:r>
     </w:p>
@@ -10700,7 +10301,6 @@
                 <w:color w:val="000000" w:themeColor="text1"/>
                 <w:lang w:val="en-US"/>
               </w:rPr>
-              <w:lastRenderedPageBreak/>
               <w:t>txtLyDoNo</w:t>
             </w:r>
           </w:p>
@@ -10841,7 +10441,7 @@
       </w:pPr>
     </w:p>
     <w:sectPr>
-      <w:footerReference w:type="default" r:id="rId11"/>
+      <w:footerReference w:type="default" r:id="rId13"/>
       <w:pgSz w:w="11906" w:h="16838"/>
       <w:pgMar w:top="1134" w:right="1134" w:bottom="1134" w:left="1418" w:header="708" w:footer="708" w:gutter="0"/>
       <w:cols w:space="720"/>

</xml_diff>